<commit_message>
Add Data and code availability section with GitHub reviewer URL.
Co-authored-by: Cursor <cursoragent@cursor.com>
</commit_message>
<xml_diff>
--- a/LifeSim_Paper_v6.docx
+++ b/LifeSim_Paper_v6.docx
@@ -11079,6 +11079,36 @@
           <w:i w:val="0"/>
           <w:sz w:val="28"/>
         </w:rPr>
+        <w:t>6. Data and code availability</w:t>
+      </w:r>
+    </w:p>
+    <w:p>
+      <w:pPr>
+        <w:spacing w:after="160" w:before="0" w:line="240" w:lineRule="auto"/>
+        <w:ind w:firstLine="432"/>
+      </w:pPr>
+      <w:r>
+        <w:rPr>
+          <w:rFonts w:ascii="Times New Roman" w:hAnsi="Times New Roman" w:eastAsia="Times New Roman"/>
+          <w:b w:val="0"/>
+          <w:i w:val="0"/>
+          <w:sz w:val="22"/>
+        </w:rPr>
+        <w:t>Source code, frozen evaluation logs, reproduction scripts, and the figures used in this manuscript are available at https://github.com/hsmazumdar/LifeSim-FeelMemory. Locked leave-one-out and ablation CSVs that generate Tables 1–12 reside under EvalLogs/paper_results/ in that repository. The snapshot is intended for manuscript review and independent rerun of the honest evaluation protocol.</w:t>
+      </w:r>
+    </w:p>
+    <w:p>
+      <w:pPr>
+        <w:pStyle w:val="Heading1"/>
+        <w:spacing w:before="280" w:after="160"/>
+      </w:pPr>
+      <w:r>
+        <w:rPr>
+          <w:rFonts w:ascii="Times New Roman" w:hAnsi="Times New Roman" w:eastAsia="Times New Roman"/>
+          <w:b/>
+          <w:i w:val="0"/>
+          <w:sz w:val="28"/>
+        </w:rPr>
         <w:t>References</w:t>
       </w:r>
     </w:p>

</xml_diff>